<commit_message>
Reference directive 0274 and district appeals in the FOI draft
Co-Authored-By: Claude Opus 5.5 <noreply@anthropic.com>
Claude-Session: https://claude.ai/code/session_01AvePAVX1iu6f8WktU4YpYs
</commit_message>
<xml_diff>
--- a/research/בקשת-חופש-מידע-משרד-החינוך.docx
+++ b/research/בקשת-חופש-מידע-משרד-החינוך.docx
@@ -109,7 +109,7 @@
           <w:sz w:val="24"/>
           <w:rtl/>
         </w:rPr>
-        <w:t>1. בהתאם לחוק חופש המידע, התשנ"ח-1998 (להלן: "החוק"), אבקש לקבל את המידע המפורט להלן, הנוגע לבקשות לפטור מחוק לימוד חובה, התש"ט-1949, לשם חינוך ביתי.</w:t>
+        <w:t>1. בהתאם לחוק חופש המידע, התשנ"ח-1998 (להלן: "החוק"), אבקש לקבל את המידע המפורט להלן, הנוגע לבקשות לפטור מחוק לימוד חובה, התש"ט-1949, לשם חינוך ביתי, ובכלל זה בקשות המטופלות לפי הוראת הקבע 0274 "פטור מחוק לימוד חובה לשם חינוך ביתי" והוראות קודמות לה.</w:t>
       </w:r>
     </w:p>
     <w:p>
@@ -207,7 +207,7 @@
           <w:sz w:val="24"/>
           <w:rtl/>
         </w:rPr>
-        <w:t>א.5. מספר הערעורים או הבקשות לעיון חוזר שהוגשו על החלטות דחייה, ותוצאותיהם.</w:t>
+        <w:t>א.5. מספר העררים שהוגשו למנכ"ל על החלטות מנהלי המחוזות, ותוצאותיהם (התקבל, נדחה, התקבל חלקית).</w:t>
       </w:r>
     </w:p>
     <w:p>
@@ -249,7 +249,7 @@
           <w:sz w:val="24"/>
           <w:rtl/>
         </w:rPr>
-        <w:t>ב.1. הנהלים, ההנחיות, חוזרי המנכ"ל וההנחיות הפנימיות שבתוקף בעניין פטור לחינוך ביתי, ובכלל זה הקריטריונים לאישור ולדחייה.</w:t>
+        <w:t>ב.1. הנוסח המלא והעדכני של הוראת הקבע 0274 על נספחיה, וכן הנהלים, ההנחיות, חוזרי המנכ"ל וההנחיות הפנימיות שבתוקף בעניין פטור לחינוך ביתי, ובכלל זה הקריטריונים לאישור ולדחייה.</w:t>
       </w:r>
     </w:p>
     <w:p>

</xml_diff>